<commit_message>
GHL case studies: 8–9 Oct timed results PASS, regression QA reports refreshed with re-test addendum, links now PDF
Co-Authored-By: Claude Opus 5.5 <noreply@anthropic.com>
Claude-Session: https://claude.ai/code/session_019P4R6aK9NFoD2SU6sDZRiB
</commit_message>
<xml_diff>
--- a/public/documents/Fairy_Property_Group_GHL_Regression_QA_Report.docx
+++ b/public/documents/Fairy_Property_Group_GHL_Regression_QA_Report.docx
@@ -242,7 +242,7 @@
           </w:tcPr>
           <w:p>
             <w:r>
-              <w:t>9</w:t>
+              <w:t>11</w:t>
             </w:r>
           </w:p>
         </w:tc>
@@ -272,7 +272,7 @@
           </w:tcPr>
           <w:p>
             <w:r>
-              <w:t>3</w:t>
+              <w:t>1</w:t>
             </w:r>
           </w:p>
         </w:tc>
@@ -283,7 +283,7 @@
         <w:pStyle w:val="BodyText"/>
       </w:pPr>
       <w:r>
-        <w:t>No test failed. Three cases were not executed live: the time-based 24h/1h reminders, reactivation reply routing (needs real inbound replies), and the WF02 Warm/Cold/Missing-info branches. Six emails were delivered to the test inbox. Four minor issues found during the run were fixed afterwards (see Defect Summary).</w:t>
+        <w:t>No test failed. Three cases were not executed live: the time-based 24h/1h reminders, reactivation reply routing (needs real inbound replies), and the WF02 Warm/Cold/Missing-info branches. Six emails were delivered to the test inbox. Four minor issues found during the run were fixed afterwards (see Defect Summary). Update (9 October 2026): FPG-REG-010 and FPG-REG-012 were re-run live and passed, so 11 of 12 cases have now passed with none failed. Only FPG-REG-011 (reply routing) remains not executed, because it needs real inbound replies. See the re-test addendum at the end.</w:t>
       </w:r>
     </w:p>
     <w:p>
@@ -878,17 +878,17 @@
           </w:tcPr>
           <w:p>
             <w:r>
-              <w:t>Time-based; appointment cancelled first</w:t>
-            </w:r>
-          </w:p>
-        </w:tc>
-        <w:tc>
-          <w:tcPr>
-            <w:tcW w:type="dxa" w:w="1872"/>
-          </w:tcPr>
-          <w:p>
-            <w:r>
-              <w:t>NOT EXECUTED</w:t>
+              <w:t>Re-run 7–8 Oct: 24h and 1h reminder emails delivered on time</w:t>
+            </w:r>
+          </w:p>
+        </w:tc>
+        <w:tc>
+          <w:tcPr>
+            <w:tcW w:type="dxa" w:w="1872"/>
+          </w:tcPr>
+          <w:p>
+            <w:r>
+              <w:t>PASS</w:t>
             </w:r>
           </w:p>
         </w:tc>
@@ -982,17 +982,17 @@
           </w:tcPr>
           <w:p>
             <w:r>
-              <w:t>Only Hot run live; logic reviewed</w:t>
-            </w:r>
-          </w:p>
-        </w:tc>
-        <w:tc>
-          <w:tcPr>
-            <w:tcW w:type="dxa" w:w="1872"/>
-          </w:tcPr>
-          <w:p>
-            <w:r>
-              <w:t>NOT EXECUTED</w:t>
+              <w:t>Re-run 7 Oct: Warm, Cold and Missing-info each took their own branch</w:t>
+            </w:r>
+          </w:p>
+        </w:tc>
+        <w:tc>
+          <w:tcPr>
+            <w:tcW w:type="dxa" w:w="1872"/>
+          </w:tcPr>
+          <w:p>
+            <w:r>
+              <w:t>PASS</w:t>
             </w:r>
           </w:p>
         </w:tc>
@@ -1355,7 +1355,7 @@
         <w:pStyle w:val="Compact"/>
       </w:pPr>
       <w:r>
-        <w:t>Status: NOT EXECUTED. Waits are appointment-relative; the test appointment was cancelled before they were due. Configuration reviewed in the builder.</w:t>
+        <w:t>Status: PASS (re-run 7–8 Oct 2026). A consultation booked about 30 hours ahead received “Reminder: your buyer consultation is tomorrow” at 06:00 PHT on 7 Oct and “Starting in 1 hour: your buyer consultation” at 05:01 PHT on 8 Oct. Originally NOT EXECUTED on 25 Sep because the test appointment was cancelled first.</w:t>
       </w:r>
     </w:p>
     <w:p>
@@ -1387,7 +1387,7 @@
         <w:pStyle w:val="Compact"/>
       </w:pPr>
       <w:r>
-        <w:t>Status: NOT EXECUTED live. Only the Hot branch was exercised end to end; earlier builder tests covered Hot only. Branch conditions reviewed in the builder.</w:t>
+        <w:t>Status: PASS (re-run 7 Oct 2026). Timeline 3–6 months set Lead Temperature Warm and sent the enquiry email; 12+ months set Cold, sent the long-term nurture email and entered the 30-day loop; a contact with no timeline took Missing-info and received the ask-for-details email. Originally NOT EXECUTED live on 25 Sep.</w:t>
       </w:r>
     </w:p>
     <w:p>
@@ -1780,6 +1780,291 @@
       </w:pPr>
       <w:r>
         <w:t>Not claimed: reminder timing (010), reply routing (011), Warm/Cold/Missing branches (012), SMS (not built), Conversation AI (built, switched off).</w:t>
+      </w:r>
+    </w:p>
+    <w:p>
+      <w:pPr>
+        <w:pStyle w:val="Heading2"/>
+      </w:pPr>
+      <w:r>
+        <w:t>Re-test addendum (6–9 October 2026)</w:t>
+      </w:r>
+    </w:p>
+    <w:p>
+      <w:r>
+        <w:t>Workflows added or changed after the 25 September run, and the cases that were not executed then, were tested live between 6 and 9 October 2026.</w:t>
+      </w:r>
+    </w:p>
+    <w:tbl>
+      <w:tblPr>
+        <w:tblW w:type="auto" w:w="0"/>
+        <w:tblLook w:firstColumn="1" w:firstRow="1" w:lastColumn="0" w:lastRow="0" w:noHBand="0" w:noVBand="1" w:val="04A0"/>
+      </w:tblPr>
+      <w:tblGrid>
+        <w:gridCol w:w="3120"/>
+        <w:gridCol w:w="3120"/>
+        <w:gridCol w:w="3120"/>
+      </w:tblGrid>
+      <w:tr>
+        <w:tc>
+          <w:tcPr>
+            <w:tcW w:type="dxa" w:w="3120"/>
+          </w:tcPr>
+          <w:p>
+            <w:r>
+              <w:t>Check</w:t>
+            </w:r>
+          </w:p>
+        </w:tc>
+        <w:tc>
+          <w:tcPr>
+            <w:tcW w:type="dxa" w:w="3120"/>
+          </w:tcPr>
+          <w:p>
+            <w:r>
+              <w:t>Observed</w:t>
+            </w:r>
+          </w:p>
+        </w:tc>
+        <w:tc>
+          <w:tcPr>
+            <w:tcW w:type="dxa" w:w="3120"/>
+          </w:tcPr>
+          <w:p>
+            <w:r>
+              <w:t>Result</w:t>
+            </w:r>
+          </w:p>
+        </w:tc>
+      </w:tr>
+      <w:tr>
+        <w:tc>
+          <w:tcPr>
+            <w:tcW w:type="dxa" w:w="3120"/>
+          </w:tcPr>
+          <w:p>
+            <w:r>
+              <w:t>FPG-REG-010 — 24h and 1h reminders</w:t>
+            </w:r>
+          </w:p>
+        </w:tc>
+        <w:tc>
+          <w:tcPr>
+            <w:tcW w:type="dxa" w:w="3120"/>
+          </w:tcPr>
+          <w:p>
+            <w:r>
+              <w:t>24h email delivered 7 Oct 06:00 PHT; 1h email delivered 8 Oct 05:01 PHT</w:t>
+            </w:r>
+          </w:p>
+        </w:tc>
+        <w:tc>
+          <w:tcPr>
+            <w:tcW w:type="dxa" w:w="3120"/>
+          </w:tcPr>
+          <w:p>
+            <w:r>
+              <w:t>PASS</w:t>
+            </w:r>
+          </w:p>
+        </w:tc>
+      </w:tr>
+      <w:tr>
+        <w:tc>
+          <w:tcPr>
+            <w:tcW w:type="dxa" w:w="3120"/>
+          </w:tcPr>
+          <w:p>
+            <w:r>
+              <w:t>FPG-REG-012 — Warm / Cold / Missing-info</w:t>
+            </w:r>
+          </w:p>
+        </w:tc>
+        <w:tc>
+          <w:tcPr>
+            <w:tcW w:type="dxa" w:w="3120"/>
+          </w:tcPr>
+          <w:p>
+            <w:r>
+              <w:t>Each timeline set the right temperature and sent its own email; Cold entered the 30-day loop</w:t>
+            </w:r>
+          </w:p>
+        </w:tc>
+        <w:tc>
+          <w:tcPr>
+            <w:tcW w:type="dxa" w:w="3120"/>
+          </w:tcPr>
+          <w:p>
+            <w:r>
+              <w:t>PASS</w:t>
+            </w:r>
+          </w:p>
+        </w:tc>
+      </w:tr>
+      <w:tr>
+        <w:tc>
+          <w:tcPr>
+            <w:tcW w:type="dxa" w:w="3120"/>
+          </w:tcPr>
+          <w:p>
+            <w:r>
+              <w:t>WF07 — SMS consent gate (seller form)</w:t>
+            </w:r>
+          </w:p>
+        </w:tc>
+        <w:tc>
+          <w:tcPr>
+            <w:tcW w:type="dxa" w:w="3120"/>
+          </w:tcPr>
+          <w:p>
+            <w:r>
+              <w:t>Consent ticked: SMS step executed (not delivered, no number). Not ticked: no SMS step. Agent alert and confirmation email ran for both</w:t>
+            </w:r>
+          </w:p>
+        </w:tc>
+        <w:tc>
+          <w:tcPr>
+            <w:tcW w:type="dxa" w:w="3120"/>
+          </w:tcPr>
+          <w:p>
+            <w:r>
+              <w:t>PASS</w:t>
+            </w:r>
+          </w:p>
+        </w:tc>
+      </w:tr>
+      <w:tr>
+        <w:tc>
+          <w:tcPr>
+            <w:tcW w:type="dxa" w:w="3120"/>
+          </w:tcPr>
+          <w:p>
+            <w:r>
+              <w:t>WF08 nurture start + WF10 stop</w:t>
+            </w:r>
+          </w:p>
+        </w:tc>
+        <w:tc>
+          <w:tcPr>
+            <w:tcW w:type="dxa" w:w="3120"/>
+          </w:tcPr>
+          <w:p>
+            <w:r>
+              <w:t>Appraisal Done enrolled the seller in WF08; moving to Listed removed them (“Removed by external workflow action”)</w:t>
+            </w:r>
+          </w:p>
+        </w:tc>
+        <w:tc>
+          <w:tcPr>
+            <w:tcW w:type="dxa" w:w="3120"/>
+          </w:tcPr>
+          <w:p>
+            <w:r>
+              <w:t>PASS</w:t>
+            </w:r>
+          </w:p>
+        </w:tc>
+      </w:tr>
+      <w:tr>
+        <w:tc>
+          <w:tcPr>
+            <w:tcW w:type="dxa" w:w="3120"/>
+          </w:tcPr>
+          <w:p>
+            <w:r>
+              <w:t>UTM capture + Agency Owner View dashboard</w:t>
+            </w:r>
+          </w:p>
+        </w:tc>
+        <w:tc>
+          <w:tcPr>
+            <w:tcW w:type="dxa" w:w="3120"/>
+          </w:tcPr>
+          <w:p>
+            <w:r>
+              <w:t>Seller-form UTMs saved on the contact and counted in “Leads by UTM Source”. The coded buyer funnel page does not pass UTMs yet (per-client setup)</w:t>
+            </w:r>
+          </w:p>
+        </w:tc>
+        <w:tc>
+          <w:tcPr>
+            <w:tcW w:type="dxa" w:w="3120"/>
+          </w:tcPr>
+          <w:p>
+            <w:r>
+              <w:t>PASS (seller form)</w:t>
+            </w:r>
+          </w:p>
+        </w:tc>
+      </w:tr>
+      <w:tr>
+        <w:tc>
+          <w:tcPr>
+            <w:tcW w:type="dxa" w:w="3120"/>
+          </w:tcPr>
+          <w:p>
+            <w:r>
+              <w:t>Snapshot v3</w:t>
+            </w:r>
+          </w:p>
+        </w:tc>
+        <w:tc>
+          <w:tcPr>
+            <w:tcW w:type="dxa" w:w="3120"/>
+          </w:tcPr>
+          <w:p>
+            <w:r>
+              <w:t>Saved 7 Oct with all 117 assets (21 workflows, 2 dashboards, 57 custom fields, 3 pipelines)</w:t>
+            </w:r>
+          </w:p>
+        </w:tc>
+        <w:tc>
+          <w:tcPr>
+            <w:tcW w:type="dxa" w:w="3120"/>
+          </w:tcPr>
+          <w:p>
+            <w:r>
+              <w:t>DONE</w:t>
+            </w:r>
+          </w:p>
+        </w:tc>
+      </w:tr>
+      <w:tr>
+        <w:tc>
+          <w:tcPr>
+            <w:tcW w:type="dxa" w:w="3120"/>
+          </w:tcPr>
+          <w:p>
+            <w:r>
+              <w:t>FPG-REG-011 — reply routing</w:t>
+            </w:r>
+          </w:p>
+        </w:tc>
+        <w:tc>
+          <w:tcPr>
+            <w:tcW w:type="dxa" w:w="3120"/>
+          </w:tcPr>
+          <w:p>
+            <w:r>
+              <w:t>Still needs real inbound replies; branch logic reviewed in the builder</w:t>
+            </w:r>
+          </w:p>
+        </w:tc>
+        <w:tc>
+          <w:tcPr>
+            <w:tcW w:type="dxa" w:w="3120"/>
+          </w:tcPr>
+          <w:p>
+            <w:r>
+              <w:t>NOT EXECUTED</w:t>
+            </w:r>
+          </w:p>
+        </w:tc>
+      </w:tr>
+    </w:tbl>
+    <w:p>
+      <w:r>
+        <w:t>All re-tests used fictional test contacts and email only. The sub-account has no purchased phone number, so SMS steps can be shown executing in the logs but no text message was delivered.</w:t>
       </w:r>
     </w:p>
     <w:sectPr/>

</xml_diff>

<commit_message>
Fairy Skin: confirm no-SMS path for non-consented booking; refresh QA report PDFs
Co-Authored-By: Claude Opus 5.5 <noreply@anthropic.com>
Claude-Session: https://claude.ai/code/session_019P4R6aK9NFoD2SU6sDZRiB
</commit_message>
<xml_diff>
--- a/public/documents/Fairy_Property_Group_GHL_Regression_QA_Report.docx
+++ b/public/documents/Fairy_Property_Group_GHL_Regression_QA_Report.docx
@@ -283,7 +283,7 @@
         <w:pStyle w:val="BodyText"/>
       </w:pPr>
       <w:r>
-        <w:t>No test failed. Three cases were not executed live: the time-based 24h/1h reminders, reactivation reply routing (needs real inbound replies), and the WF02 Warm/Cold/Missing-info branches. Six emails were delivered to the test inbox. Four minor issues found during the run were fixed afterwards (see Defect Summary). Update (9 October 2026): FPG-REG-010 and FPG-REG-012 were re-run live and passed, so 11 of 12 cases have now passed with none failed. Only FPG-REG-011 (reply routing) remains not executed, because it needs real inbound replies. See the re-test addendum at the end.</w:t>
+        <w:t>No test failed. Three cases were not executed live: the time-based 24h/1h reminders, reactivation reply routing (needs real inbound replies), and the WF02 Warm/Cold/Missing-info branches. Six emails were delivered to the test inbox. Four minor issues found during the run were fixed afterwards (see Defect Summary). Update (9 October 2026): FPG-REG-010 and FPG-REG-012 were re-run live and passed, so 11 of 12 cases have now passed with none failed. Only FPG-REG-011 (reply routing) remains not executed, because it needs real inbound replies. See the re-test addendum at the end. Update (9 October 2026): FPG-REG-010 and FPG-REG-012 were re-run live and passed, so 11 of 12 cases have now passed with none failed. Only FPG-REG-011 (reply routing) remains not executed, because it needs real inbound replies. See the re-test addendum at the end.</w:t>
       </w:r>
     </w:p>
     <w:p>
@@ -1780,6 +1780,291 @@
       </w:pPr>
       <w:r>
         <w:t>Not claimed: reminder timing (010), reply routing (011), Warm/Cold/Missing branches (012), SMS (not built), Conversation AI (built, switched off).</w:t>
+      </w:r>
+    </w:p>
+    <w:p>
+      <w:pPr>
+        <w:pStyle w:val="Heading2"/>
+      </w:pPr>
+      <w:r>
+        <w:t>Re-test addendum (6–9 October 2026)</w:t>
+      </w:r>
+    </w:p>
+    <w:p>
+      <w:r>
+        <w:t>Workflows added or changed after the 25 September run, and the cases that were not executed then, were tested live between 6 and 9 October 2026.</w:t>
+      </w:r>
+    </w:p>
+    <w:tbl>
+      <w:tblPr>
+        <w:tblW w:type="auto" w:w="0"/>
+        <w:tblLook w:firstColumn="1" w:firstRow="1" w:lastColumn="0" w:lastRow="0" w:noHBand="0" w:noVBand="1" w:val="04A0"/>
+      </w:tblPr>
+      <w:tblGrid>
+        <w:gridCol w:w="3120"/>
+        <w:gridCol w:w="3120"/>
+        <w:gridCol w:w="3120"/>
+      </w:tblGrid>
+      <w:tr>
+        <w:tc>
+          <w:tcPr>
+            <w:tcW w:type="dxa" w:w="3120"/>
+          </w:tcPr>
+          <w:p>
+            <w:r>
+              <w:t>Check</w:t>
+            </w:r>
+          </w:p>
+        </w:tc>
+        <w:tc>
+          <w:tcPr>
+            <w:tcW w:type="dxa" w:w="3120"/>
+          </w:tcPr>
+          <w:p>
+            <w:r>
+              <w:t>Observed</w:t>
+            </w:r>
+          </w:p>
+        </w:tc>
+        <w:tc>
+          <w:tcPr>
+            <w:tcW w:type="dxa" w:w="3120"/>
+          </w:tcPr>
+          <w:p>
+            <w:r>
+              <w:t>Result</w:t>
+            </w:r>
+          </w:p>
+        </w:tc>
+      </w:tr>
+      <w:tr>
+        <w:tc>
+          <w:tcPr>
+            <w:tcW w:type="dxa" w:w="3120"/>
+          </w:tcPr>
+          <w:p>
+            <w:r>
+              <w:t>FPG-REG-010 — 24h and 1h reminders</w:t>
+            </w:r>
+          </w:p>
+        </w:tc>
+        <w:tc>
+          <w:tcPr>
+            <w:tcW w:type="dxa" w:w="3120"/>
+          </w:tcPr>
+          <w:p>
+            <w:r>
+              <w:t>24h email delivered 7 Oct 06:00 PHT; 1h email delivered 8 Oct 05:01 PHT</w:t>
+            </w:r>
+          </w:p>
+        </w:tc>
+        <w:tc>
+          <w:tcPr>
+            <w:tcW w:type="dxa" w:w="3120"/>
+          </w:tcPr>
+          <w:p>
+            <w:r>
+              <w:t>PASS</w:t>
+            </w:r>
+          </w:p>
+        </w:tc>
+      </w:tr>
+      <w:tr>
+        <w:tc>
+          <w:tcPr>
+            <w:tcW w:type="dxa" w:w="3120"/>
+          </w:tcPr>
+          <w:p>
+            <w:r>
+              <w:t>FPG-REG-012 — Warm / Cold / Missing-info</w:t>
+            </w:r>
+          </w:p>
+        </w:tc>
+        <w:tc>
+          <w:tcPr>
+            <w:tcW w:type="dxa" w:w="3120"/>
+          </w:tcPr>
+          <w:p>
+            <w:r>
+              <w:t>Each timeline set the right temperature and sent its own email; Cold entered the 30-day loop</w:t>
+            </w:r>
+          </w:p>
+        </w:tc>
+        <w:tc>
+          <w:tcPr>
+            <w:tcW w:type="dxa" w:w="3120"/>
+          </w:tcPr>
+          <w:p>
+            <w:r>
+              <w:t>PASS</w:t>
+            </w:r>
+          </w:p>
+        </w:tc>
+      </w:tr>
+      <w:tr>
+        <w:tc>
+          <w:tcPr>
+            <w:tcW w:type="dxa" w:w="3120"/>
+          </w:tcPr>
+          <w:p>
+            <w:r>
+              <w:t>WF07 — SMS consent gate (seller form)</w:t>
+            </w:r>
+          </w:p>
+        </w:tc>
+        <w:tc>
+          <w:tcPr>
+            <w:tcW w:type="dxa" w:w="3120"/>
+          </w:tcPr>
+          <w:p>
+            <w:r>
+              <w:t>Consent ticked: SMS step executed (not delivered, no number). Not ticked: no SMS step. Agent alert and confirmation email ran for both</w:t>
+            </w:r>
+          </w:p>
+        </w:tc>
+        <w:tc>
+          <w:tcPr>
+            <w:tcW w:type="dxa" w:w="3120"/>
+          </w:tcPr>
+          <w:p>
+            <w:r>
+              <w:t>PASS</w:t>
+            </w:r>
+          </w:p>
+        </w:tc>
+      </w:tr>
+      <w:tr>
+        <w:tc>
+          <w:tcPr>
+            <w:tcW w:type="dxa" w:w="3120"/>
+          </w:tcPr>
+          <w:p>
+            <w:r>
+              <w:t>WF08 nurture start + WF10 stop</w:t>
+            </w:r>
+          </w:p>
+        </w:tc>
+        <w:tc>
+          <w:tcPr>
+            <w:tcW w:type="dxa" w:w="3120"/>
+          </w:tcPr>
+          <w:p>
+            <w:r>
+              <w:t>Appraisal Done enrolled the seller in WF08; moving to Listed removed them (“Removed by external workflow action”)</w:t>
+            </w:r>
+          </w:p>
+        </w:tc>
+        <w:tc>
+          <w:tcPr>
+            <w:tcW w:type="dxa" w:w="3120"/>
+          </w:tcPr>
+          <w:p>
+            <w:r>
+              <w:t>PASS</w:t>
+            </w:r>
+          </w:p>
+        </w:tc>
+      </w:tr>
+      <w:tr>
+        <w:tc>
+          <w:tcPr>
+            <w:tcW w:type="dxa" w:w="3120"/>
+          </w:tcPr>
+          <w:p>
+            <w:r>
+              <w:t>UTM capture + Agency Owner View dashboard</w:t>
+            </w:r>
+          </w:p>
+        </w:tc>
+        <w:tc>
+          <w:tcPr>
+            <w:tcW w:type="dxa" w:w="3120"/>
+          </w:tcPr>
+          <w:p>
+            <w:r>
+              <w:t>Seller-form UTMs saved on the contact and counted in “Leads by UTM Source”. The coded buyer funnel page does not pass UTMs yet (per-client setup)</w:t>
+            </w:r>
+          </w:p>
+        </w:tc>
+        <w:tc>
+          <w:tcPr>
+            <w:tcW w:type="dxa" w:w="3120"/>
+          </w:tcPr>
+          <w:p>
+            <w:r>
+              <w:t>PASS (seller form)</w:t>
+            </w:r>
+          </w:p>
+        </w:tc>
+      </w:tr>
+      <w:tr>
+        <w:tc>
+          <w:tcPr>
+            <w:tcW w:type="dxa" w:w="3120"/>
+          </w:tcPr>
+          <w:p>
+            <w:r>
+              <w:t>Snapshot v3</w:t>
+            </w:r>
+          </w:p>
+        </w:tc>
+        <w:tc>
+          <w:tcPr>
+            <w:tcW w:type="dxa" w:w="3120"/>
+          </w:tcPr>
+          <w:p>
+            <w:r>
+              <w:t>Saved 7 Oct with all 117 assets (21 workflows, 2 dashboards, 57 custom fields, 3 pipelines)</w:t>
+            </w:r>
+          </w:p>
+        </w:tc>
+        <w:tc>
+          <w:tcPr>
+            <w:tcW w:type="dxa" w:w="3120"/>
+          </w:tcPr>
+          <w:p>
+            <w:r>
+              <w:t>DONE</w:t>
+            </w:r>
+          </w:p>
+        </w:tc>
+      </w:tr>
+      <w:tr>
+        <w:tc>
+          <w:tcPr>
+            <w:tcW w:type="dxa" w:w="3120"/>
+          </w:tcPr>
+          <w:p>
+            <w:r>
+              <w:t>FPG-REG-011 — reply routing</w:t>
+            </w:r>
+          </w:p>
+        </w:tc>
+        <w:tc>
+          <w:tcPr>
+            <w:tcW w:type="dxa" w:w="3120"/>
+          </w:tcPr>
+          <w:p>
+            <w:r>
+              <w:t>Still needs real inbound replies; branch logic reviewed in the builder</w:t>
+            </w:r>
+          </w:p>
+        </w:tc>
+        <w:tc>
+          <w:tcPr>
+            <w:tcW w:type="dxa" w:w="3120"/>
+          </w:tcPr>
+          <w:p>
+            <w:r>
+              <w:t>NOT EXECUTED</w:t>
+            </w:r>
+          </w:p>
+        </w:tc>
+      </w:tr>
+    </w:tbl>
+    <w:p>
+      <w:r>
+        <w:t>All re-tests used fictional test contacts and email only. The sub-account has no purchased phone number, so SMS steps can be shown executing in the logs but no text message was delivered.</w:t>
       </w:r>
     </w:p>
     <w:p>

</xml_diff>

<commit_message>
Fix duplicated re-test addendum in QA reports
Co-Authored-By: Claude Opus 5.5 <noreply@anthropic.com>
Claude-Session: https://claude.ai/code/session_019P4R6aK9NFoD2SU6sDZRiB
</commit_message>
<xml_diff>
--- a/public/documents/Fairy_Property_Group_GHL_Regression_QA_Report.docx
+++ b/public/documents/Fairy_Property_Group_GHL_Regression_QA_Report.docx
@@ -283,7 +283,7 @@
         <w:pStyle w:val="BodyText"/>
       </w:pPr>
       <w:r>
-        <w:t>No test failed. Three cases were not executed live: the time-based 24h/1h reminders, reactivation reply routing (needs real inbound replies), and the WF02 Warm/Cold/Missing-info branches. Six emails were delivered to the test inbox. Four minor issues found during the run were fixed afterwards (see Defect Summary). Update (9 October 2026): FPG-REG-010 and FPG-REG-012 were re-run live and passed, so 11 of 12 cases have now passed with none failed. Only FPG-REG-011 (reply routing) remains not executed, because it needs real inbound replies. See the re-test addendum at the end. Update (9 October 2026): FPG-REG-010 and FPG-REG-012 were re-run live and passed, so 11 of 12 cases have now passed with none failed. Only FPG-REG-011 (reply routing) remains not executed, because it needs real inbound replies. See the re-test addendum at the end.</w:t>
+        <w:t>No test failed. Three cases were not executed live: the time-based 24h/1h reminders, reactivation reply routing (needs real inbound replies), and the WF02 Warm/Cold/Missing-info branches. Six emails were delivered to the test inbox. Four minor issues found during the run were fixed afterwards (see Defect Summary). Update (9 October 2026): FPG-REG-010 and FPG-REG-012 were re-run live and passed, so 11 of 12 cases have now passed with none failed. Only FPG-REG-011 (reply routing) remains not executed, because it needs real inbound replies. See the re-test addendum at the end.</w:t>
       </w:r>
     </w:p>
     <w:p>
@@ -1780,291 +1780,6 @@
       </w:pPr>
       <w:r>
         <w:t>Not claimed: reminder timing (010), reply routing (011), Warm/Cold/Missing branches (012), SMS (not built), Conversation AI (built, switched off).</w:t>
-      </w:r>
-    </w:p>
-    <w:p>
-      <w:pPr>
-        <w:pStyle w:val="Heading2"/>
-      </w:pPr>
-      <w:r>
-        <w:t>Re-test addendum (6–9 October 2026)</w:t>
-      </w:r>
-    </w:p>
-    <w:p>
-      <w:r>
-        <w:t>Workflows added or changed after the 25 September run, and the cases that were not executed then, were tested live between 6 and 9 October 2026.</w:t>
-      </w:r>
-    </w:p>
-    <w:tbl>
-      <w:tblPr>
-        <w:tblW w:type="auto" w:w="0"/>
-        <w:tblLook w:firstColumn="1" w:firstRow="1" w:lastColumn="0" w:lastRow="0" w:noHBand="0" w:noVBand="1" w:val="04A0"/>
-      </w:tblPr>
-      <w:tblGrid>
-        <w:gridCol w:w="3120"/>
-        <w:gridCol w:w="3120"/>
-        <w:gridCol w:w="3120"/>
-      </w:tblGrid>
-      <w:tr>
-        <w:tc>
-          <w:tcPr>
-            <w:tcW w:type="dxa" w:w="3120"/>
-          </w:tcPr>
-          <w:p>
-            <w:r>
-              <w:t>Check</w:t>
-            </w:r>
-          </w:p>
-        </w:tc>
-        <w:tc>
-          <w:tcPr>
-            <w:tcW w:type="dxa" w:w="3120"/>
-          </w:tcPr>
-          <w:p>
-            <w:r>
-              <w:t>Observed</w:t>
-            </w:r>
-          </w:p>
-        </w:tc>
-        <w:tc>
-          <w:tcPr>
-            <w:tcW w:type="dxa" w:w="3120"/>
-          </w:tcPr>
-          <w:p>
-            <w:r>
-              <w:t>Result</w:t>
-            </w:r>
-          </w:p>
-        </w:tc>
-      </w:tr>
-      <w:tr>
-        <w:tc>
-          <w:tcPr>
-            <w:tcW w:type="dxa" w:w="3120"/>
-          </w:tcPr>
-          <w:p>
-            <w:r>
-              <w:t>FPG-REG-010 — 24h and 1h reminders</w:t>
-            </w:r>
-          </w:p>
-        </w:tc>
-        <w:tc>
-          <w:tcPr>
-            <w:tcW w:type="dxa" w:w="3120"/>
-          </w:tcPr>
-          <w:p>
-            <w:r>
-              <w:t>24h email delivered 7 Oct 06:00 PHT; 1h email delivered 8 Oct 05:01 PHT</w:t>
-            </w:r>
-          </w:p>
-        </w:tc>
-        <w:tc>
-          <w:tcPr>
-            <w:tcW w:type="dxa" w:w="3120"/>
-          </w:tcPr>
-          <w:p>
-            <w:r>
-              <w:t>PASS</w:t>
-            </w:r>
-          </w:p>
-        </w:tc>
-      </w:tr>
-      <w:tr>
-        <w:tc>
-          <w:tcPr>
-            <w:tcW w:type="dxa" w:w="3120"/>
-          </w:tcPr>
-          <w:p>
-            <w:r>
-              <w:t>FPG-REG-012 — Warm / Cold / Missing-info</w:t>
-            </w:r>
-          </w:p>
-        </w:tc>
-        <w:tc>
-          <w:tcPr>
-            <w:tcW w:type="dxa" w:w="3120"/>
-          </w:tcPr>
-          <w:p>
-            <w:r>
-              <w:t>Each timeline set the right temperature and sent its own email; Cold entered the 30-day loop</w:t>
-            </w:r>
-          </w:p>
-        </w:tc>
-        <w:tc>
-          <w:tcPr>
-            <w:tcW w:type="dxa" w:w="3120"/>
-          </w:tcPr>
-          <w:p>
-            <w:r>
-              <w:t>PASS</w:t>
-            </w:r>
-          </w:p>
-        </w:tc>
-      </w:tr>
-      <w:tr>
-        <w:tc>
-          <w:tcPr>
-            <w:tcW w:type="dxa" w:w="3120"/>
-          </w:tcPr>
-          <w:p>
-            <w:r>
-              <w:t>WF07 — SMS consent gate (seller form)</w:t>
-            </w:r>
-          </w:p>
-        </w:tc>
-        <w:tc>
-          <w:tcPr>
-            <w:tcW w:type="dxa" w:w="3120"/>
-          </w:tcPr>
-          <w:p>
-            <w:r>
-              <w:t>Consent ticked: SMS step executed (not delivered, no number). Not ticked: no SMS step. Agent alert and confirmation email ran for both</w:t>
-            </w:r>
-          </w:p>
-        </w:tc>
-        <w:tc>
-          <w:tcPr>
-            <w:tcW w:type="dxa" w:w="3120"/>
-          </w:tcPr>
-          <w:p>
-            <w:r>
-              <w:t>PASS</w:t>
-            </w:r>
-          </w:p>
-        </w:tc>
-      </w:tr>
-      <w:tr>
-        <w:tc>
-          <w:tcPr>
-            <w:tcW w:type="dxa" w:w="3120"/>
-          </w:tcPr>
-          <w:p>
-            <w:r>
-              <w:t>WF08 nurture start + WF10 stop</w:t>
-            </w:r>
-          </w:p>
-        </w:tc>
-        <w:tc>
-          <w:tcPr>
-            <w:tcW w:type="dxa" w:w="3120"/>
-          </w:tcPr>
-          <w:p>
-            <w:r>
-              <w:t>Appraisal Done enrolled the seller in WF08; moving to Listed removed them (“Removed by external workflow action”)</w:t>
-            </w:r>
-          </w:p>
-        </w:tc>
-        <w:tc>
-          <w:tcPr>
-            <w:tcW w:type="dxa" w:w="3120"/>
-          </w:tcPr>
-          <w:p>
-            <w:r>
-              <w:t>PASS</w:t>
-            </w:r>
-          </w:p>
-        </w:tc>
-      </w:tr>
-      <w:tr>
-        <w:tc>
-          <w:tcPr>
-            <w:tcW w:type="dxa" w:w="3120"/>
-          </w:tcPr>
-          <w:p>
-            <w:r>
-              <w:t>UTM capture + Agency Owner View dashboard</w:t>
-            </w:r>
-          </w:p>
-        </w:tc>
-        <w:tc>
-          <w:tcPr>
-            <w:tcW w:type="dxa" w:w="3120"/>
-          </w:tcPr>
-          <w:p>
-            <w:r>
-              <w:t>Seller-form UTMs saved on the contact and counted in “Leads by UTM Source”. The coded buyer funnel page does not pass UTMs yet (per-client setup)</w:t>
-            </w:r>
-          </w:p>
-        </w:tc>
-        <w:tc>
-          <w:tcPr>
-            <w:tcW w:type="dxa" w:w="3120"/>
-          </w:tcPr>
-          <w:p>
-            <w:r>
-              <w:t>PASS (seller form)</w:t>
-            </w:r>
-          </w:p>
-        </w:tc>
-      </w:tr>
-      <w:tr>
-        <w:tc>
-          <w:tcPr>
-            <w:tcW w:type="dxa" w:w="3120"/>
-          </w:tcPr>
-          <w:p>
-            <w:r>
-              <w:t>Snapshot v3</w:t>
-            </w:r>
-          </w:p>
-        </w:tc>
-        <w:tc>
-          <w:tcPr>
-            <w:tcW w:type="dxa" w:w="3120"/>
-          </w:tcPr>
-          <w:p>
-            <w:r>
-              <w:t>Saved 7 Oct with all 117 assets (21 workflows, 2 dashboards, 57 custom fields, 3 pipelines)</w:t>
-            </w:r>
-          </w:p>
-        </w:tc>
-        <w:tc>
-          <w:tcPr>
-            <w:tcW w:type="dxa" w:w="3120"/>
-          </w:tcPr>
-          <w:p>
-            <w:r>
-              <w:t>DONE</w:t>
-            </w:r>
-          </w:p>
-        </w:tc>
-      </w:tr>
-      <w:tr>
-        <w:tc>
-          <w:tcPr>
-            <w:tcW w:type="dxa" w:w="3120"/>
-          </w:tcPr>
-          <w:p>
-            <w:r>
-              <w:t>FPG-REG-011 — reply routing</w:t>
-            </w:r>
-          </w:p>
-        </w:tc>
-        <w:tc>
-          <w:tcPr>
-            <w:tcW w:type="dxa" w:w="3120"/>
-          </w:tcPr>
-          <w:p>
-            <w:r>
-              <w:t>Still needs real inbound replies; branch logic reviewed in the builder</w:t>
-            </w:r>
-          </w:p>
-        </w:tc>
-        <w:tc>
-          <w:tcPr>
-            <w:tcW w:type="dxa" w:w="3120"/>
-          </w:tcPr>
-          <w:p>
-            <w:r>
-              <w:t>NOT EXECUTED</w:t>
-            </w:r>
-          </w:p>
-        </w:tc>
-      </w:tr>
-    </w:tbl>
-    <w:p>
-      <w:r>
-        <w:t>All re-tests used fictional test contacts and email only. The sub-account has no purchased phone number, so SMS steps can be shown executing in the logs but no text message was delivered.</w:t>
       </w:r>
     </w:p>
     <w:p>

</xml_diff>